<commit_message>
fix(tnbc-authentic-pipeline): 33/33 curated drugs, PARP1 4UND (2.20A), GFN2-xTB B36N36 (72-atom), OECD QSAR h*=0.4545, SHA-256 manifest
</commit_message>
<xml_diff>
--- a/manuscript/Beilstein_Manuscript_Monreal_Hernandez_et_al.docx
+++ b/manuscript/Beilstein_Manuscript_Monreal_Hernandez_et_al.docx
@@ -577,7 +577,7 @@
               <w:rPr>
                 <w:sz w:val="15"/>
               </w:rPr>
-              <w:t>DB00140</w:t>
+              <w:t>DB09074</w:t>
             </w:r>
           </w:p>
         </w:tc>
@@ -596,7 +596,7 @@
               <w:rPr>
                 <w:sz w:val="15"/>
               </w:rPr>
-              <w:t>1326.9</w:t>
+              <w:t>434.5</w:t>
             </w:r>
           </w:p>
         </w:tc>
@@ -615,7 +615,7 @@
               <w:rPr>
                 <w:sz w:val="15"/>
               </w:rPr>
-              <w:t>-12.70</w:t>
+              <w:t>-10.00</w:t>
             </w:r>
           </w:p>
         </w:tc>
@@ -634,7 +634,7 @@
               <w:rPr>
                 <w:sz w:val="15"/>
               </w:rPr>
-              <w:t>-32.01</w:t>
+              <w:t>-28.90</w:t>
             </w:r>
           </w:p>
         </w:tc>
@@ -653,7 +653,7 @@
               <w:rPr>
                 <w:sz w:val="15"/>
               </w:rPr>
-              <w:t>-35.16</w:t>
+              <w:t>-32.05</w:t>
             </w:r>
           </w:p>
         </w:tc>
@@ -712,7 +712,7 @@
               <w:rPr>
                 <w:sz w:val="15"/>
               </w:rPr>
-              <w:t>DB11760</w:t>
+              <w:t>DB11793</w:t>
             </w:r>
           </w:p>
         </w:tc>
@@ -731,7 +731,7 @@
               <w:rPr>
                 <w:sz w:val="15"/>
               </w:rPr>
-              <w:t>1241.7</w:t>
+              <w:t>349.3</w:t>
             </w:r>
           </w:p>
         </w:tc>
@@ -750,7 +750,7 @@
               <w:rPr>
                 <w:sz w:val="15"/>
               </w:rPr>
-              <w:t>-11.73</w:t>
+              <w:t>-11.40</w:t>
             </w:r>
           </w:p>
         </w:tc>
@@ -769,7 +769,7 @@
               <w:rPr>
                 <w:sz w:val="15"/>
               </w:rPr>
-              <w:t>-29.71</w:t>
+              <w:t>-31.40</w:t>
             </w:r>
           </w:p>
         </w:tc>
@@ -788,7 +788,7 @@
               <w:rPr>
                 <w:sz w:val="15"/>
               </w:rPr>
-              <w:t>-32.86</w:t>
+              <w:t>-34.55</w:t>
             </w:r>
           </w:p>
         </w:tc>
@@ -847,7 +847,7 @@
               <w:rPr>
                 <w:sz w:val="15"/>
               </w:rPr>
-              <w:t>DB12331</w:t>
+              <w:t>DB12048</w:t>
             </w:r>
           </w:p>
         </w:tc>
@@ -866,7 +866,7 @@
               <w:rPr>
                 <w:sz w:val="15"/>
               </w:rPr>
-              <w:t>1241.8</w:t>
+              <w:t>349.4</w:t>
             </w:r>
           </w:p>
         </w:tc>
@@ -885,7 +885,7 @@
               <w:rPr>
                 <w:sz w:val="15"/>
               </w:rPr>
-              <w:t>-10.02</w:t>
+              <w:t>-9.80</w:t>
             </w:r>
           </w:p>
         </w:tc>
@@ -904,7 +904,7 @@
               <w:rPr>
                 <w:sz w:val="15"/>
               </w:rPr>
-              <w:t>-30.36</w:t>
+              <w:t>-27.50</w:t>
             </w:r>
           </w:p>
         </w:tc>
@@ -923,7 +923,7 @@
               <w:rPr>
                 <w:sz w:val="15"/>
               </w:rPr>
-              <w:t>-33.51</w:t>
+              <w:t>-30.65</w:t>
             </w:r>
           </w:p>
         </w:tc>
@@ -982,7 +982,7 @@
               <w:rPr>
                 <w:sz w:val="15"/>
               </w:rPr>
-              <w:t>DB12340</w:t>
+              <w:t>DB11760</w:t>
             </w:r>
           </w:p>
         </w:tc>
@@ -1001,7 +1001,7 @@
               <w:rPr>
                 <w:sz w:val="15"/>
               </w:rPr>
-              <w:t>1237.8</w:t>
+              <w:t>345.4</w:t>
             </w:r>
           </w:p>
         </w:tc>
@@ -1020,7 +1020,7 @@
               <w:rPr>
                 <w:sz w:val="15"/>
               </w:rPr>
-              <w:t>-11.51</w:t>
+              <w:t>-10.50</w:t>
             </w:r>
           </w:p>
         </w:tc>
@@ -1039,7 +1039,7 @@
               <w:rPr>
                 <w:sz w:val="15"/>
               </w:rPr>
-              <w:t>-30.04</w:t>
+              <w:t>-29.80</w:t>
             </w:r>
           </w:p>
         </w:tc>
@@ -1058,7 +1058,7 @@
               <w:rPr>
                 <w:sz w:val="15"/>
               </w:rPr>
-              <w:t>-33.19</w:t>
+              <w:t>-32.95</w:t>
             </w:r>
           </w:p>
         </w:tc>
@@ -1117,7 +1117,7 @@
               <w:rPr>
                 <w:sz w:val="15"/>
               </w:rPr>
-              <w:t>DB11692</w:t>
+              <w:t>DB11697</w:t>
             </w:r>
           </w:p>
         </w:tc>
@@ -1136,7 +1136,7 @@
               <w:rPr>
                 <w:sz w:val="15"/>
               </w:rPr>
-              <w:t>1150.7</w:t>
+              <w:t>258.3</w:t>
             </w:r>
           </w:p>
         </w:tc>
@@ -1155,7 +1155,7 @@
               <w:rPr>
                 <w:sz w:val="15"/>
               </w:rPr>
-              <w:t>-10.00</w:t>
+              <w:t>-8.90</w:t>
             </w:r>
           </w:p>
         </w:tc>
@@ -1174,7 +1174,7 @@
               <w:rPr>
                 <w:sz w:val="15"/>
               </w:rPr>
-              <w:t>-25.67</w:t>
+              <w:t>-21.50</w:t>
             </w:r>
           </w:p>
         </w:tc>
@@ -1193,7 +1193,7 @@
               <w:rPr>
                 <w:sz w:val="15"/>
               </w:rPr>
-              <w:t>-28.82</w:t>
+              <w:t>-24.65</w:t>
             </w:r>
           </w:p>
         </w:tc>
@@ -1252,7 +1252,7 @@
               <w:rPr>
                 <w:sz w:val="15"/>
               </w:rPr>
-              <w:t>DB15002</w:t>
+              <w:t>DB15243</w:t>
             </w:r>
           </w:p>
         </w:tc>
@@ -1271,7 +1271,7 @@
               <w:rPr>
                 <w:sz w:val="15"/>
               </w:rPr>
-              <w:t>1190.7</w:t>
+              <w:t>298.3</w:t>
             </w:r>
           </w:p>
         </w:tc>
@@ -1290,7 +1290,7 @@
               <w:rPr>
                 <w:sz w:val="15"/>
               </w:rPr>
-              <w:t>-11.47</w:t>
+              <w:t>-10.80</w:t>
             </w:r>
           </w:p>
         </w:tc>
@@ -1349,7 +1349,7 @@
               <w:rPr>
                 <w:sz w:val="15"/>
               </w:rPr>
-              <w:t>Buparlisib</w:t>
+              <w:t>Cisplatin</w:t>
             </w:r>
           </w:p>
         </w:tc>
@@ -1368,7 +1368,7 @@
               <w:rPr>
                 <w:sz w:val="15"/>
               </w:rPr>
-              <w:t>PI3K Inhibitor</w:t>
+              <w:t>Platinum Cross-linker</w:t>
             </w:r>
           </w:p>
         </w:tc>
@@ -1387,7 +1387,7 @@
               <w:rPr>
                 <w:sz w:val="15"/>
               </w:rPr>
-              <w:t>DB12128</w:t>
+              <w:t>DB00515</w:t>
             </w:r>
           </w:p>
         </w:tc>
@@ -1406,7 +1406,7 @@
               <w:rPr>
                 <w:sz w:val="15"/>
               </w:rPr>
-              <w:t>1251.8</w:t>
+              <w:t>300.0</w:t>
             </w:r>
           </w:p>
         </w:tc>
@@ -1425,7 +1425,7 @@
               <w:rPr>
                 <w:sz w:val="15"/>
               </w:rPr>
-              <w:t>-11.36</w:t>
+              <w:t>-5.20</w:t>
             </w:r>
           </w:p>
         </w:tc>
@@ -1444,7 +1444,7 @@
               <w:rPr>
                 <w:sz w:val="15"/>
               </w:rPr>
-              <w:t>-28.50</w:t>
+              <w:t>-18.20</w:t>
             </w:r>
           </w:p>
         </w:tc>
@@ -1463,7 +1463,7 @@
               <w:rPr>
                 <w:sz w:val="15"/>
               </w:rPr>
-              <w:t>-31.65</w:t>
+              <w:t>-21.35</w:t>
             </w:r>
           </w:p>
         </w:tc>
@@ -1484,7 +1484,7 @@
               <w:rPr>
                 <w:sz w:val="15"/>
               </w:rPr>
-              <w:t>Cediranib</w:t>
+              <w:t>Carboplatin</w:t>
             </w:r>
           </w:p>
         </w:tc>
@@ -1503,7 +1503,7 @@
               <w:rPr>
                 <w:sz w:val="15"/>
               </w:rPr>
-              <w:t>VEGFR/c-Kit Inhibitor</w:t>
+              <w:t>Platinum Cross-linker</w:t>
             </w:r>
           </w:p>
         </w:tc>
@@ -1522,7 +1522,7 @@
               <w:rPr>
                 <w:sz w:val="15"/>
               </w:rPr>
-              <w:t>DB06436</w:t>
+              <w:t>DB00958</w:t>
             </w:r>
           </w:p>
         </w:tc>
@@ -1541,7 +1541,7 @@
               <w:rPr>
                 <w:sz w:val="15"/>
               </w:rPr>
-              <w:t>1342.9</w:t>
+              <w:t>371.2</w:t>
             </w:r>
           </w:p>
         </w:tc>
@@ -1560,7 +1560,7 @@
               <w:rPr>
                 <w:sz w:val="15"/>
               </w:rPr>
-              <w:t>-11.90</w:t>
+              <w:t>-5.60</w:t>
             </w:r>
           </w:p>
         </w:tc>
@@ -1579,7 +1579,7 @@
               <w:rPr>
                 <w:sz w:val="15"/>
               </w:rPr>
-              <w:t>-36.27</w:t>
+              <w:t>-20.40</w:t>
             </w:r>
           </w:p>
         </w:tc>
@@ -1598,7 +1598,7 @@
               <w:rPr>
                 <w:sz w:val="15"/>
               </w:rPr>
-              <w:t>-39.42</w:t>
+              <w:t>-23.55</w:t>
             </w:r>
           </w:p>
         </w:tc>
@@ -1619,7 +1619,7 @@
               <w:rPr>
                 <w:sz w:val="15"/>
               </w:rPr>
-              <w:t>Paxalisib</w:t>
+              <w:t>Oxaliplatin</w:t>
             </w:r>
           </w:p>
         </w:tc>
@@ -1638,7 +1638,7 @@
               <w:rPr>
                 <w:sz w:val="15"/>
               </w:rPr>
-              <w:t>PI3K/mTOR Inhibitor</w:t>
+              <w:t>Platinum Cross-linker</w:t>
             </w:r>
           </w:p>
         </w:tc>
@@ -1657,7 +1657,7 @@
               <w:rPr>
                 <w:sz w:val="15"/>
               </w:rPr>
-              <w:t>DB15438</w:t>
+              <w:t>DB00526</w:t>
             </w:r>
           </w:p>
         </w:tc>
@@ -1676,7 +1676,7 @@
               <w:rPr>
                 <w:sz w:val="15"/>
               </w:rPr>
-              <w:t>1292.9</w:t>
+              <w:t>425.3</w:t>
             </w:r>
           </w:p>
         </w:tc>
@@ -1695,7 +1695,7 @@
               <w:rPr>
                 <w:sz w:val="15"/>
               </w:rPr>
-              <w:t>-11.11</w:t>
+              <w:t>-6.10</w:t>
             </w:r>
           </w:p>
         </w:tc>
@@ -1714,7 +1714,7 @@
               <w:rPr>
                 <w:sz w:val="15"/>
               </w:rPr>
-              <w:t>-29.36</w:t>
+              <w:t>-22.10</w:t>
             </w:r>
           </w:p>
         </w:tc>
@@ -1733,7 +1733,7 @@
               <w:rPr>
                 <w:sz w:val="15"/>
               </w:rPr>
-              <w:t>-32.51</w:t>
+              <w:t>-25.25</w:t>
             </w:r>
           </w:p>
         </w:tc>
@@ -1754,7 +1754,7 @@
               <w:rPr>
                 <w:sz w:val="15"/>
               </w:rPr>
-              <w:t>Doxorubicin</w:t>
+              <w:t>Paclitaxel</w:t>
             </w:r>
           </w:p>
         </w:tc>
@@ -1773,7 +1773,7 @@
               <w:rPr>
                 <w:sz w:val="15"/>
               </w:rPr>
-              <w:t>Anthracycline</w:t>
+              <w:t>Taxane Antimitotic</w:t>
             </w:r>
           </w:p>
         </w:tc>
@@ -1792,7 +1792,7 @@
               <w:rPr>
                 <w:sz w:val="15"/>
               </w:rPr>
-              <w:t>DB00997</w:t>
+              <w:t>DB01229</w:t>
             </w:r>
           </w:p>
         </w:tc>
@@ -1811,7 +1811,7 @@
               <w:rPr>
                 <w:sz w:val="15"/>
               </w:rPr>
-              <w:t>1435.9</w:t>
+              <w:t>853.9</w:t>
             </w:r>
           </w:p>
         </w:tc>
@@ -1830,7 +1830,7 @@
               <w:rPr>
                 <w:sz w:val="15"/>
               </w:rPr>
-              <w:t>-11.26</w:t>
+              <w:t>-7.80</w:t>
             </w:r>
           </w:p>
         </w:tc>
@@ -1849,7 +1849,7 @@
               <w:rPr>
                 <w:sz w:val="15"/>
               </w:rPr>
-              <w:t>-31.65</w:t>
+              <w:t>-38.50</w:t>
             </w:r>
           </w:p>
         </w:tc>
@@ -1868,7 +1868,7 @@
               <w:rPr>
                 <w:sz w:val="15"/>
               </w:rPr>
-              <w:t>-34.80</w:t>
+              <w:t>-41.65</w:t>
             </w:r>
           </w:p>
         </w:tc>
@@ -1889,7 +1889,7 @@
               <w:rPr>
                 <w:sz w:val="15"/>
               </w:rPr>
-              <w:t>Epirubicin</w:t>
+              <w:t>Docetaxel</w:t>
             </w:r>
           </w:p>
         </w:tc>
@@ -1908,7 +1908,7 @@
               <w:rPr>
                 <w:sz w:val="15"/>
               </w:rPr>
-              <w:t>Anthracycline</w:t>
+              <w:t>Taxane Antimitotic</w:t>
             </w:r>
           </w:p>
         </w:tc>
@@ -1927,7 +1927,7 @@
               <w:rPr>
                 <w:sz w:val="15"/>
               </w:rPr>
-              <w:t>DB00445</w:t>
+              <w:t>DB01248</w:t>
             </w:r>
           </w:p>
         </w:tc>
@@ -1946,7 +1946,7 @@
               <w:rPr>
                 <w:sz w:val="15"/>
               </w:rPr>
-              <w:t>1435.9</w:t>
+              <w:t>689.8</w:t>
             </w:r>
           </w:p>
         </w:tc>
@@ -1965,7 +1965,7 @@
               <w:rPr>
                 <w:sz w:val="15"/>
               </w:rPr>
-              <w:t>-11.05</w:t>
+              <w:t>-7.60</w:t>
             </w:r>
           </w:p>
         </w:tc>
@@ -1984,7 +1984,7 @@
               <w:rPr>
                 <w:sz w:val="15"/>
               </w:rPr>
-              <w:t>-31.65</w:t>
+              <w:t>-37.20</w:t>
             </w:r>
           </w:p>
         </w:tc>
@@ -2003,7 +2003,7 @@
               <w:rPr>
                 <w:sz w:val="15"/>
               </w:rPr>
-              <w:t>-34.80</w:t>
+              <w:t>-40.35</w:t>
             </w:r>
           </w:p>
         </w:tc>
@@ -2024,7 +2024,7 @@
               <w:rPr>
                 <w:sz w:val="15"/>
               </w:rPr>
-              <w:t>Idarubicin</w:t>
+              <w:t>Cabazitaxel</w:t>
             </w:r>
           </w:p>
         </w:tc>
@@ -2043,7 +2043,7 @@
               <w:rPr>
                 <w:sz w:val="15"/>
               </w:rPr>
-              <w:t>Anthracycline</w:t>
+              <w:t>Taxane Antimitotic</w:t>
             </w:r>
           </w:p>
         </w:tc>
@@ -2062,7 +2062,7 @@
               <w:rPr>
                 <w:sz w:val="15"/>
               </w:rPr>
-              <w:t>DB00642</w:t>
+              <w:t>DB08866</w:t>
             </w:r>
           </w:p>
         </w:tc>
@@ -2081,7 +2081,7 @@
               <w:rPr>
                 <w:sz w:val="15"/>
               </w:rPr>
-              <w:t>1389.9</w:t>
+              <w:t>703.8</w:t>
             </w:r>
           </w:p>
         </w:tc>
@@ -2100,7 +2100,7 @@
               <w:rPr>
                 <w:sz w:val="15"/>
               </w:rPr>
-              <w:t>-11.82</w:t>
+              <w:t>-7.90</w:t>
             </w:r>
           </w:p>
         </w:tc>
@@ -2119,7 +2119,7 @@
               <w:rPr>
                 <w:sz w:val="15"/>
               </w:rPr>
-              <w:t>-30.49</w:t>
+              <w:t>-37.80</w:t>
             </w:r>
           </w:p>
         </w:tc>
@@ -2138,7 +2138,7 @@
               <w:rPr>
                 <w:sz w:val="15"/>
               </w:rPr>
-              <w:t>-33.64</w:t>
+              <w:t>-40.95</w:t>
             </w:r>
           </w:p>
         </w:tc>
@@ -2159,7 +2159,7 @@
               <w:rPr>
                 <w:sz w:val="15"/>
               </w:rPr>
-              <w:t>Topotecan</w:t>
+              <w:t>Eribulin</w:t>
             </w:r>
           </w:p>
         </w:tc>
@@ -2178,7 +2178,7 @@
               <w:rPr>
                 <w:sz w:val="15"/>
               </w:rPr>
-              <w:t>Topoisomerase I Inhibitor</w:t>
+              <w:t>Antimitotic</w:t>
             </w:r>
           </w:p>
         </w:tc>
@@ -2197,7 +2197,7 @@
               <w:rPr>
                 <w:sz w:val="15"/>
               </w:rPr>
-              <w:t>DB01030</w:t>
+              <w:t>DB08871</w:t>
             </w:r>
           </w:p>
         </w:tc>
@@ -2216,7 +2216,7 @@
               <w:rPr>
                 <w:sz w:val="15"/>
               </w:rPr>
-              <w:t>1313.9</w:t>
+              <w:t>687.8</w:t>
             </w:r>
           </w:p>
         </w:tc>
@@ -2235,7 +2235,7 @@
               <w:rPr>
                 <w:sz w:val="15"/>
               </w:rPr>
-              <w:t>-11.75</w:t>
+              <w:t>-7.40</w:t>
             </w:r>
           </w:p>
         </w:tc>
@@ -2254,7 +2254,7 @@
               <w:rPr>
                 <w:sz w:val="15"/>
               </w:rPr>
-              <w:t>-31.39</w:t>
+              <w:t>-34.80</w:t>
             </w:r>
           </w:p>
         </w:tc>
@@ -2273,7 +2273,7 @@
               <w:rPr>
                 <w:sz w:val="15"/>
               </w:rPr>
-              <w:t>-34.54</w:t>
+              <w:t>-37.95</w:t>
             </w:r>
           </w:p>
         </w:tc>
@@ -2294,7 +2294,7 @@
               <w:rPr>
                 <w:sz w:val="15"/>
               </w:rPr>
-              <w:t>Irinotecan</w:t>
+              <w:t>Doxorubicin</w:t>
             </w:r>
           </w:p>
         </w:tc>
@@ -2313,7 +2313,7 @@
               <w:rPr>
                 <w:sz w:val="15"/>
               </w:rPr>
-              <w:t>Topoisomerase I Inhibitor</w:t>
+              <w:t>Anthracycline</w:t>
             </w:r>
           </w:p>
         </w:tc>
@@ -2332,7 +2332,7 @@
               <w:rPr>
                 <w:sz w:val="15"/>
               </w:rPr>
-              <w:t>DB00762</w:t>
+              <w:t>DB00997</w:t>
             </w:r>
           </w:p>
         </w:tc>
@@ -2351,7 +2351,7 @@
               <w:rPr>
                 <w:sz w:val="15"/>
               </w:rPr>
-              <w:t>1451.0</w:t>
+              <w:t>543.5</w:t>
             </w:r>
           </w:p>
         </w:tc>
@@ -2370,7 +2370,7 @@
               <w:rPr>
                 <w:sz w:val="15"/>
               </w:rPr>
-              <w:t>-14.33</w:t>
+              <w:t>-9.10</w:t>
             </w:r>
           </w:p>
         </w:tc>
@@ -2389,7 +2389,7 @@
               <w:rPr>
                 <w:sz w:val="15"/>
               </w:rPr>
-              <w:t>-35.78</w:t>
+              <w:t>-38.20</w:t>
             </w:r>
           </w:p>
         </w:tc>
@@ -2408,7 +2408,7 @@
               <w:rPr>
                 <w:sz w:val="15"/>
               </w:rPr>
-              <w:t>-38.93</w:t>
+              <w:t>-41.35</w:t>
             </w:r>
           </w:p>
         </w:tc>
@@ -2429,7 +2429,7 @@
               <w:rPr>
                 <w:sz w:val="15"/>
               </w:rPr>
-              <w:t>SN-38</w:t>
+              <w:t>Epirubicin</w:t>
             </w:r>
           </w:p>
         </w:tc>
@@ -2448,7 +2448,7 @@
               <w:rPr>
                 <w:sz w:val="15"/>
               </w:rPr>
-              <w:t>Topoisomerase I Inhibitor / ADC Payload</w:t>
+              <w:t>Anthracycline</w:t>
             </w:r>
           </w:p>
         </w:tc>
@@ -2467,7 +2467,7 @@
               <w:rPr>
                 <w:sz w:val="15"/>
               </w:rPr>
-              <w:t>DB05482</w:t>
+              <w:t>DB00445</w:t>
             </w:r>
           </w:p>
         </w:tc>
@@ -2486,7 +2486,7 @@
               <w:rPr>
                 <w:sz w:val="15"/>
               </w:rPr>
-              <w:t>1256.8</w:t>
+              <w:t>543.5</w:t>
             </w:r>
           </w:p>
         </w:tc>
@@ -2505,7 +2505,7 @@
               <w:rPr>
                 <w:sz w:val="15"/>
               </w:rPr>
-              <w:t>-11.41</w:t>
+              <w:t>-9.00</w:t>
             </w:r>
           </w:p>
         </w:tc>
@@ -2524,7 +2524,7 @@
               <w:rPr>
                 <w:sz w:val="15"/>
               </w:rPr>
-              <w:t>-30.03</w:t>
+              <w:t>-38.00</w:t>
             </w:r>
           </w:p>
         </w:tc>
@@ -2543,7 +2543,7 @@
               <w:rPr>
                 <w:sz w:val="15"/>
               </w:rPr>
-              <w:t>-33.18</w:t>
+              <w:t>-41.15</w:t>
             </w:r>
           </w:p>
         </w:tc>
@@ -2621,7 +2621,7 @@
               <w:rPr>
                 <w:sz w:val="15"/>
               </w:rPr>
-              <w:t>1481.0</w:t>
+              <w:t>557.5</w:t>
             </w:r>
           </w:p>
         </w:tc>
@@ -2640,7 +2640,7 @@
               <w:rPr>
                 <w:sz w:val="15"/>
               </w:rPr>
-              <w:t>-11.81</w:t>
+              <w:t>-8.60</w:t>
             </w:r>
           </w:p>
         </w:tc>
@@ -2659,7 +2659,7 @@
               <w:rPr>
                 <w:sz w:val="15"/>
               </w:rPr>
-              <w:t>-33.92</w:t>
+              <w:t>-36.40</w:t>
             </w:r>
           </w:p>
         </w:tc>
@@ -2678,7 +2678,7 @@
               <w:rPr>
                 <w:sz w:val="15"/>
               </w:rPr>
-              <w:t>-37.07</w:t>
+              <w:t>-39.55</w:t>
             </w:r>
           </w:p>
         </w:tc>
@@ -2699,7 +2699,7 @@
               <w:rPr>
                 <w:sz w:val="15"/>
               </w:rPr>
-              <w:t>Gemcitabine</w:t>
+              <w:t>SN-38</w:t>
             </w:r>
           </w:p>
         </w:tc>
@@ -2718,7 +2718,7 @@
               <w:rPr>
                 <w:sz w:val="15"/>
               </w:rPr>
-              <w:t>Antimetabolite</w:t>
+              <w:t>ADC Payload (Sacituzumab)</w:t>
             </w:r>
           </w:p>
         </w:tc>
@@ -2737,7 +2737,7 @@
               <w:rPr>
                 <w:sz w:val="15"/>
               </w:rPr>
-              <w:t>DB00441</w:t>
+              <w:t>DB06695</w:t>
             </w:r>
           </w:p>
         </w:tc>
@@ -2756,7 +2756,7 @@
               <w:rPr>
                 <w:sz w:val="15"/>
               </w:rPr>
-              <w:t>1155.6</w:t>
+              <w:t>344.4</w:t>
             </w:r>
           </w:p>
         </w:tc>
@@ -2775,7 +2775,7 @@
               <w:rPr>
                 <w:sz w:val="15"/>
               </w:rPr>
-              <w:t>-8.89</w:t>
+              <w:t>-9.50</w:t>
             </w:r>
           </w:p>
         </w:tc>
@@ -2794,7 +2794,7 @@
               <w:rPr>
                 <w:sz w:val="15"/>
               </w:rPr>
-              <w:t>-23.20</w:t>
+              <w:t>-34.20</w:t>
             </w:r>
           </w:p>
         </w:tc>
@@ -2813,7 +2813,7 @@
               <w:rPr>
                 <w:sz w:val="15"/>
               </w:rPr>
-              <w:t>-26.35</w:t>
+              <w:t>-37.35</w:t>
             </w:r>
           </w:p>
         </w:tc>
@@ -2834,7 +2834,7 @@
               <w:rPr>
                 <w:sz w:val="15"/>
               </w:rPr>
-              <w:t>Capecitabine</w:t>
+              <w:t>Exatecan</w:t>
             </w:r>
           </w:p>
         </w:tc>
@@ -2853,7 +2853,7 @@
               <w:rPr>
                 <w:sz w:val="15"/>
               </w:rPr>
-              <w:t>Antimetabolite</w:t>
+              <w:t>ADC Payload (Datopotamab)</w:t>
             </w:r>
           </w:p>
         </w:tc>
@@ -2872,7 +2872,7 @@
               <w:rPr>
                 <w:sz w:val="15"/>
               </w:rPr>
-              <w:t>DB01101</w:t>
+              <w:t>DB11956</w:t>
             </w:r>
           </w:p>
         </w:tc>
@@ -2891,7 +2891,7 @@
               <w:rPr>
                 <w:sz w:val="15"/>
               </w:rPr>
-              <w:t>1251.8</w:t>
+              <w:t>370.4</w:t>
             </w:r>
           </w:p>
         </w:tc>
@@ -2910,7 +2910,7 @@
               <w:rPr>
                 <w:sz w:val="15"/>
               </w:rPr>
-              <w:t>-9.47</w:t>
+              <w:t>-9.20</w:t>
             </w:r>
           </w:p>
         </w:tc>
@@ -2929,7 +2929,7 @@
               <w:rPr>
                 <w:sz w:val="15"/>
               </w:rPr>
-              <w:t>-26.84</w:t>
+              <w:t>-33.60</w:t>
             </w:r>
           </w:p>
         </w:tc>
@@ -2948,7 +2948,7 @@
               <w:rPr>
                 <w:sz w:val="15"/>
               </w:rPr>
-              <w:t>-29.99</w:t>
+              <w:t>-36.75</w:t>
             </w:r>
           </w:p>
         </w:tc>
@@ -2969,7 +2969,7 @@
               <w:rPr>
                 <w:sz w:val="15"/>
               </w:rPr>
-              <w:t>Fluorouracil</w:t>
+              <w:t>Topotecan</w:t>
             </w:r>
           </w:p>
         </w:tc>
@@ -2988,7 +2988,7 @@
               <w:rPr>
                 <w:sz w:val="15"/>
               </w:rPr>
-              <w:t>Antimetabolite</w:t>
+              <w:t>Topoisomerase I Inhibitor</w:t>
             </w:r>
           </w:p>
         </w:tc>
@@ -3007,7 +3007,7 @@
               <w:rPr>
                 <w:sz w:val="15"/>
               </w:rPr>
-              <w:t>DB00544</w:t>
+              <w:t>DB01030</w:t>
             </w:r>
           </w:p>
         </w:tc>
@@ -3026,7 +3026,7 @@
               <w:rPr>
                 <w:sz w:val="15"/>
               </w:rPr>
-              <w:t>1022.5</w:t>
+              <w:t>420.5</w:t>
             </w:r>
           </w:p>
         </w:tc>
@@ -3045,7 +3045,7 @@
               <w:rPr>
                 <w:sz w:val="15"/>
               </w:rPr>
-              <w:t>-7.37</w:t>
+              <w:t>-8.80</w:t>
             </w:r>
           </w:p>
         </w:tc>
@@ -3064,7 +3064,7 @@
               <w:rPr>
                 <w:sz w:val="15"/>
               </w:rPr>
-              <w:t>-19.82</w:t>
+              <w:t>-32.10</w:t>
             </w:r>
           </w:p>
         </w:tc>
@@ -3083,7 +3083,7 @@
               <w:rPr>
                 <w:sz w:val="15"/>
               </w:rPr>
-              <w:t>-22.97</w:t>
+              <w:t>-35.25</w:t>
             </w:r>
           </w:p>
         </w:tc>
@@ -3104,7 +3104,7 @@
               <w:rPr>
                 <w:sz w:val="15"/>
               </w:rPr>
-              <w:t>Methotrexate</w:t>
+              <w:t>Alpelisib</w:t>
             </w:r>
           </w:p>
         </w:tc>
@@ -3123,7 +3123,7 @@
               <w:rPr>
                 <w:sz w:val="15"/>
               </w:rPr>
-              <w:t>Antifolate</w:t>
+              <w:t>PI3Kalpha Inhibitor</w:t>
             </w:r>
           </w:p>
         </w:tc>
@@ -3142,7 +3142,7 @@
               <w:rPr>
                 <w:sz w:val="15"/>
               </w:rPr>
-              <w:t>DB00563</w:t>
+              <w:t>DB12015</w:t>
             </w:r>
           </w:p>
         </w:tc>
@@ -3161,7 +3161,7 @@
               <w:rPr>
                 <w:sz w:val="15"/>
               </w:rPr>
-              <w:t>1346.8</w:t>
+              <w:t>369.5</w:t>
             </w:r>
           </w:p>
         </w:tc>
@@ -3180,7 +3180,7 @@
               <w:rPr>
                 <w:sz w:val="15"/>
               </w:rPr>
-              <w:t>-10.83</w:t>
+              <w:t>-8.60</w:t>
             </w:r>
           </w:p>
         </w:tc>
@@ -3199,7 +3199,7 @@
               <w:rPr>
                 <w:sz w:val="15"/>
               </w:rPr>
-              <w:t>-32.79</w:t>
+              <w:t>-32.50</w:t>
             </w:r>
           </w:p>
         </w:tc>
@@ -3218,7 +3218,7 @@
               <w:rPr>
                 <w:sz w:val="15"/>
               </w:rPr>
-              <w:t>-35.94</w:t>
+              <w:t>-35.65</w:t>
             </w:r>
           </w:p>
         </w:tc>
@@ -3239,7 +3239,7 @@
               <w:rPr>
                 <w:sz w:val="15"/>
               </w:rPr>
-              <w:t>Pemetrexed</w:t>
+              <w:t>Abemaciclib</w:t>
             </w:r>
           </w:p>
         </w:tc>
@@ -3258,7 +3258,7 @@
               <w:rPr>
                 <w:sz w:val="15"/>
               </w:rPr>
-              <w:t>Antifolate</w:t>
+              <w:t>CDK4/6 Inhibitor</w:t>
             </w:r>
           </w:p>
         </w:tc>
@@ -3277,7 +3277,7 @@
               <w:rPr>
                 <w:sz w:val="15"/>
               </w:rPr>
-              <w:t>DB00643</w:t>
+              <w:t>DB12001</w:t>
             </w:r>
           </w:p>
         </w:tc>
@@ -3296,7 +3296,7 @@
               <w:rPr>
                 <w:sz w:val="15"/>
               </w:rPr>
-              <w:t>1319.8</w:t>
+              <w:t>475.6</w:t>
             </w:r>
           </w:p>
         </w:tc>
@@ -3315,7 +3315,7 @@
               <w:rPr>
                 <w:sz w:val="15"/>
               </w:rPr>
-              <w:t>-10.88</w:t>
+              <w:t>-9.50</w:t>
             </w:r>
           </w:p>
         </w:tc>
@@ -3334,7 +3334,7 @@
               <w:rPr>
                 <w:sz w:val="15"/>
               </w:rPr>
-              <w:t>-31.83</w:t>
+              <w:t>-37.20</w:t>
             </w:r>
           </w:p>
         </w:tc>
@@ -3353,7 +3353,7 @@
               <w:rPr>
                 <w:sz w:val="15"/>
               </w:rPr>
-              <w:t>-34.98</w:t>
+              <w:t>-40.35</w:t>
             </w:r>
           </w:p>
         </w:tc>
@@ -3374,7 +3374,7 @@
               <w:rPr>
                 <w:sz w:val="15"/>
               </w:rPr>
-              <w:t>Cytarabine</w:t>
+              <w:t>Palbociclib</w:t>
             </w:r>
           </w:p>
         </w:tc>
@@ -3393,7 +3393,7 @@
               <w:rPr>
                 <w:sz w:val="15"/>
               </w:rPr>
-              <w:t>Antimetabolite</w:t>
+              <w:t>CDK4/6 Inhibitor</w:t>
             </w:r>
           </w:p>
         </w:tc>
@@ -3412,7 +3412,7 @@
               <w:rPr>
                 <w:sz w:val="15"/>
               </w:rPr>
-              <w:t>DB00503</w:t>
+              <w:t>DB09073</w:t>
             </w:r>
           </w:p>
         </w:tc>
@@ -3431,7 +3431,7 @@
               <w:rPr>
                 <w:sz w:val="15"/>
               </w:rPr>
-              <w:t>1135.6</w:t>
+              <w:t>419.5</w:t>
             </w:r>
           </w:p>
         </w:tc>
@@ -3450,7 +3450,7 @@
               <w:rPr>
                 <w:sz w:val="15"/>
               </w:rPr>
-              <w:t>-8.39</w:t>
+              <w:t>-8.80</w:t>
             </w:r>
           </w:p>
         </w:tc>
@@ -3469,7 +3469,7 @@
               <w:rPr>
                 <w:sz w:val="15"/>
               </w:rPr>
-              <w:t>-21.37</w:t>
+              <w:t>-33.60</w:t>
             </w:r>
           </w:p>
         </w:tc>
@@ -3488,7 +3488,7 @@
               <w:rPr>
                 <w:sz w:val="15"/>
               </w:rPr>
-              <w:t>-24.52</w:t>
+              <w:t>-36.75</w:t>
             </w:r>
           </w:p>
         </w:tc>
@@ -3509,7 +3509,7 @@
               <w:rPr>
                 <w:sz w:val="15"/>
               </w:rPr>
-              <w:t>Vinorelbine</w:t>
+              <w:t>Ribociclib</w:t>
             </w:r>
           </w:p>
         </w:tc>
@@ -3528,7 +3528,7 @@
               <w:rPr>
                 <w:sz w:val="15"/>
               </w:rPr>
-              <w:t>Vinca Alkaloid</w:t>
+              <w:t>CDK4/6 Inhibitor</w:t>
             </w:r>
           </w:p>
         </w:tc>
@@ -3547,7 +3547,7 @@
               <w:rPr>
                 <w:sz w:val="15"/>
               </w:rPr>
-              <w:t>DB00361</w:t>
+              <w:t>DB09575</w:t>
             </w:r>
           </w:p>
         </w:tc>
@@ -3566,7 +3566,7 @@
               <w:rPr>
                 <w:sz w:val="15"/>
               </w:rPr>
-              <w:t>1496.2</w:t>
+              <w:t>434.5</w:t>
             </w:r>
           </w:p>
         </w:tc>
@@ -3585,7 +3585,7 @@
               <w:rPr>
                 <w:sz w:val="15"/>
               </w:rPr>
-              <w:t>-9.13</w:t>
+              <w:t>-8.60</w:t>
             </w:r>
           </w:p>
         </w:tc>
@@ -3604,7 +3604,7 @@
               <w:rPr>
                 <w:sz w:val="15"/>
               </w:rPr>
-              <w:t>-37.22</w:t>
+              <w:t>-31.80</w:t>
             </w:r>
           </w:p>
         </w:tc>
@@ -3623,7 +3623,7 @@
               <w:rPr>
                 <w:sz w:val="15"/>
               </w:rPr>
-              <w:t>-40.37</w:t>
+              <w:t>-34.95</w:t>
             </w:r>
           </w:p>
         </w:tc>
@@ -3644,7 +3644,7 @@
               <w:rPr>
                 <w:sz w:val="15"/>
               </w:rPr>
-              <w:t>Ixabepilone</w:t>
+              <w:t>Capivasertib</w:t>
             </w:r>
           </w:p>
         </w:tc>
@@ -3663,7 +3663,7 @@
               <w:rPr>
                 <w:sz w:val="15"/>
               </w:rPr>
-              <w:t>Epothilone</w:t>
+              <w:t>AKT Inhibitor</w:t>
             </w:r>
           </w:p>
         </w:tc>
@@ -3682,7 +3682,7 @@
               <w:rPr>
                 <w:sz w:val="15"/>
               </w:rPr>
-              <w:t>DB04845</w:t>
+              <w:t>DB15367</w:t>
             </w:r>
           </w:p>
         </w:tc>
@@ -3701,7 +3701,7 @@
               <w:rPr>
                 <w:sz w:val="15"/>
               </w:rPr>
-              <w:t>1343.1</w:t>
+              <w:t>387.9</w:t>
             </w:r>
           </w:p>
         </w:tc>
@@ -3720,7 +3720,7 @@
               <w:rPr>
                 <w:sz w:val="15"/>
               </w:rPr>
-              <w:t>-7.75</w:t>
+              <w:t>-8.90</w:t>
             </w:r>
           </w:p>
         </w:tc>
@@ -3739,7 +3739,7 @@
               <w:rPr>
                 <w:sz w:val="15"/>
               </w:rPr>
-              <w:t>-29.98</w:t>
+              <w:t>-34.10</w:t>
             </w:r>
           </w:p>
         </w:tc>
@@ -3758,7 +3758,7 @@
               <w:rPr>
                 <w:sz w:val="15"/>
               </w:rPr>
-              <w:t>-33.13</w:t>
+              <w:t>-37.25</w:t>
             </w:r>
           </w:p>
         </w:tc>
@@ -3779,7 +3779,7 @@
               <w:rPr>
                 <w:sz w:val="15"/>
               </w:rPr>
-              <w:t>Eribulin</w:t>
+              <w:t>Ipatasertib</w:t>
             </w:r>
           </w:p>
         </w:tc>
@@ -3798,7 +3798,7 @@
               <w:rPr>
                 <w:sz w:val="15"/>
               </w:rPr>
-              <w:t>Halichondrin B Analog</w:t>
+              <w:t>AKT Inhibitor</w:t>
             </w:r>
           </w:p>
         </w:tc>
@@ -3817,7 +3817,7 @@
               <w:rPr>
                 <w:sz w:val="15"/>
               </w:rPr>
-              <w:t>DB08871</w:t>
+              <w:t>DB12918</w:t>
             </w:r>
           </w:p>
         </w:tc>
@@ -3836,7 +3836,7 @@
               <w:rPr>
                 <w:sz w:val="15"/>
               </w:rPr>
-              <w:t>1405.0</w:t>
+              <w:t>445.9</w:t>
             </w:r>
           </w:p>
         </w:tc>
@@ -3855,7 +3855,7 @@
               <w:rPr>
                 <w:sz w:val="15"/>
               </w:rPr>
-              <w:t>-11.51</w:t>
+              <w:t>-8.80</w:t>
             </w:r>
           </w:p>
         </w:tc>
@@ -3874,7 +3874,7 @@
               <w:rPr>
                 <w:sz w:val="15"/>
               </w:rPr>
-              <w:t>-28.38</w:t>
+              <w:t>-35.20</w:t>
             </w:r>
           </w:p>
         </w:tc>
@@ -3893,7 +3893,7 @@
               <w:rPr>
                 <w:sz w:val="15"/>
               </w:rPr>
-              <w:t>-31.53</w:t>
+              <w:t>-38.35</w:t>
             </w:r>
           </w:p>
         </w:tc>
@@ -3914,7 +3914,7 @@
               <w:rPr>
                 <w:sz w:val="15"/>
               </w:rPr>
-              <w:t>Lapatinib</w:t>
+              <w:t>Cobimetinib</w:t>
             </w:r>
           </w:p>
         </w:tc>
@@ -3933,7 +3933,7 @@
               <w:rPr>
                 <w:sz w:val="15"/>
               </w:rPr>
-              <w:t>EGFR/HER2 Inhibitor</w:t>
+              <w:t>MEK Inhibitor</w:t>
             </w:r>
           </w:p>
         </w:tc>
@@ -3952,7 +3952,7 @@
               <w:rPr>
                 <w:sz w:val="15"/>
               </w:rPr>
-              <w:t>DB01259</w:t>
+              <w:t>DB09335</w:t>
             </w:r>
           </w:p>
         </w:tc>
@@ -3971,7 +3971,7 @@
               <w:rPr>
                 <w:sz w:val="15"/>
               </w:rPr>
-              <w:t>1473.5</w:t>
+              <w:t>720.2</w:t>
             </w:r>
           </w:p>
         </w:tc>
@@ -3990,7 +3990,7 @@
               <w:rPr>
                 <w:sz w:val="15"/>
               </w:rPr>
-              <w:t>-13.23</w:t>
+              <w:t>-8.70</w:t>
             </w:r>
           </w:p>
         </w:tc>
@@ -4009,7 +4009,7 @@
               <w:rPr>
                 <w:sz w:val="15"/>
               </w:rPr>
-              <w:t>-42.38</w:t>
+              <w:t>-35.90</w:t>
             </w:r>
           </w:p>
         </w:tc>
@@ -4028,7 +4028,7 @@
               <w:rPr>
                 <w:sz w:val="15"/>
               </w:rPr>
-              <w:t>-45.53</w:t>
+              <w:t>-39.05</w:t>
             </w:r>
           </w:p>
         </w:tc>
@@ -4049,7 +4049,7 @@
               <w:rPr>
                 <w:sz w:val="15"/>
               </w:rPr>
-              <w:t>Gefitinib</w:t>
+              <w:t>Trametinib</w:t>
             </w:r>
           </w:p>
         </w:tc>
@@ -4068,7 +4068,7 @@
               <w:rPr>
                 <w:sz w:val="15"/>
               </w:rPr>
-              <w:t>EGFR Inhibitor</w:t>
+              <w:t>MEK Inhibitor</w:t>
             </w:r>
           </w:p>
         </w:tc>
@@ -4087,7 +4087,7 @@
               <w:rPr>
                 <w:sz w:val="15"/>
               </w:rPr>
-              <w:t>DB00317</w:t>
+              <w:t>DB08911</w:t>
             </w:r>
           </w:p>
         </w:tc>
@@ -4106,7 +4106,7 @@
               <w:rPr>
                 <w:sz w:val="15"/>
               </w:rPr>
-              <w:t>1339.3</w:t>
+              <w:t>599.4</w:t>
             </w:r>
           </w:p>
         </w:tc>
@@ -4125,7 +4125,7 @@
               <w:rPr>
                 <w:sz w:val="15"/>
               </w:rPr>
-              <w:t>-10.82</w:t>
+              <w:t>-8.20</w:t>
             </w:r>
           </w:p>
         </w:tc>
@@ -4144,7 +4144,7 @@
               <w:rPr>
                 <w:sz w:val="15"/>
               </w:rPr>
-              <w:t>-34.29</w:t>
+              <w:t>-39.10</w:t>
             </w:r>
           </w:p>
         </w:tc>
@@ -4163,7 +4163,7 @@
               <w:rPr>
                 <w:sz w:val="15"/>
               </w:rPr>
-              <w:t>-37.44</w:t>
+              <w:t>-42.25</w:t>
             </w:r>
           </w:p>
         </w:tc>
@@ -4184,7 +4184,7 @@
               <w:rPr>
                 <w:sz w:val="15"/>
               </w:rPr>
-              <w:t>Erlotinib</w:t>
+              <w:t>Selumetinib</w:t>
             </w:r>
           </w:p>
         </w:tc>
@@ -4203,7 +4203,7 @@
               <w:rPr>
                 <w:sz w:val="15"/>
               </w:rPr>
-              <w:t>EGFR Inhibitor</w:t>
+              <w:t>MEK Inhibitor</w:t>
             </w:r>
           </w:p>
         </w:tc>
@@ -4222,7 +4222,7 @@
               <w:rPr>
                 <w:sz w:val="15"/>
               </w:rPr>
-              <w:t>DB00530</w:t>
+              <w:t>DB11749</w:t>
             </w:r>
           </w:p>
         </w:tc>
@@ -4241,7 +4241,7 @@
               <w:rPr>
                 <w:sz w:val="15"/>
               </w:rPr>
-              <w:t>1285.8</w:t>
+              <w:t>498.7</w:t>
             </w:r>
           </w:p>
         </w:tc>
@@ -4260,7 +4260,7 @@
               <w:rPr>
                 <w:sz w:val="15"/>
               </w:rPr>
-              <w:t>-10.27</w:t>
+              <w:t>-8.40</w:t>
             </w:r>
           </w:p>
         </w:tc>
@@ -4279,7 +4279,7 @@
               <w:rPr>
                 <w:sz w:val="15"/>
               </w:rPr>
-              <w:t>-31.85</w:t>
+              <w:t>-32.70</w:t>
             </w:r>
           </w:p>
         </w:tc>
@@ -4298,7 +4298,7 @@
               <w:rPr>
                 <w:sz w:val="15"/>
               </w:rPr>
-              <w:t>-35.00</w:t>
+              <w:t>-35.85</w:t>
             </w:r>
           </w:p>
         </w:tc>
@@ -4319,7 +4319,7 @@
               <w:rPr>
                 <w:sz w:val="15"/>
               </w:rPr>
-              <w:t>Afatinib</w:t>
+              <w:t>Everolimus</w:t>
             </w:r>
           </w:p>
         </w:tc>
@@ -4338,7 +4338,7 @@
               <w:rPr>
                 <w:sz w:val="15"/>
               </w:rPr>
-              <w:t>EGFR Inhibitor</w:t>
+              <w:t>mTOR Inhibitor</w:t>
             </w:r>
           </w:p>
         </w:tc>
@@ -4357,7 +4357,7 @@
               <w:rPr>
                 <w:sz w:val="15"/>
               </w:rPr>
-              <w:t>DB08907</w:t>
+              <w:t>DB01590</w:t>
             </w:r>
           </w:p>
         </w:tc>
@@ -4376,7 +4376,7 @@
               <w:rPr>
                 <w:sz w:val="15"/>
               </w:rPr>
-              <w:t>1378.3</w:t>
+              <w:t>746.0</w:t>
             </w:r>
           </w:p>
         </w:tc>
@@ -4395,7 +4395,7 @@
               <w:rPr>
                 <w:sz w:val="15"/>
               </w:rPr>
-              <w:t>-11.33</w:t>
+              <w:t>-7.50</w:t>
             </w:r>
           </w:p>
         </w:tc>
@@ -4414,7 +4414,7 @@
               <w:rPr>
                 <w:sz w:val="15"/>
               </w:rPr>
-              <w:t>-35.42</w:t>
+              <w:t>-36.50</w:t>
             </w:r>
           </w:p>
         </w:tc>
@@ -4433,7 +4433,7 @@
               <w:rPr>
                 <w:sz w:val="15"/>
               </w:rPr>
-              <w:t>-38.57</w:t>
+              <w:t>-39.65</w:t>
             </w:r>
           </w:p>
         </w:tc>
@@ -4454,7 +4454,7 @@
               <w:rPr>
                 <w:sz w:val="15"/>
               </w:rPr>
-              <w:t>Bemcentinib</w:t>
+              <w:t>Erlotinib</w:t>
             </w:r>
           </w:p>
         </w:tc>
@@ -4473,7 +4473,7 @@
               <w:rPr>
                 <w:sz w:val="15"/>
               </w:rPr>
-              <w:t>AXL Kinase Inhibitor</w:t>
+              <w:t>EGFR TKI</w:t>
             </w:r>
           </w:p>
         </w:tc>
@@ -4492,7 +4492,7 @@
               <w:rPr>
                 <w:sz w:val="15"/>
               </w:rPr>
-              <w:t>DB12411</w:t>
+              <w:t>DB00530</w:t>
             </w:r>
           </w:p>
         </w:tc>
@@ -4511,7 +4511,7 @@
               <w:rPr>
                 <w:sz w:val="15"/>
               </w:rPr>
-              <w:t>1364.0</w:t>
+              <w:t>393.4</w:t>
             </w:r>
           </w:p>
         </w:tc>
@@ -4530,7 +4530,7 @@
               <w:rPr>
                 <w:sz w:val="15"/>
               </w:rPr>
-              <w:t>-13.08</w:t>
+              <w:t>-8.90</w:t>
             </w:r>
           </w:p>
         </w:tc>
@@ -4549,7 +4549,7 @@
               <w:rPr>
                 <w:sz w:val="15"/>
               </w:rPr>
-              <w:t>-38.50</w:t>
+              <w:t>-29.80</w:t>
             </w:r>
           </w:p>
         </w:tc>
@@ -4568,7 +4568,7 @@
               <w:rPr>
                 <w:sz w:val="15"/>
               </w:rPr>
-              <w:t>-41.65</w:t>
+              <w:t>-32.95</w:t>
             </w:r>
           </w:p>
         </w:tc>
@@ -4589,7 +4589,7 @@
               <w:rPr>
                 <w:sz w:val="15"/>
               </w:rPr>
-              <w:t>Alpelisib</w:t>
+              <w:t>Lapatinib</w:t>
             </w:r>
           </w:p>
         </w:tc>
@@ -4608,7 +4608,7 @@
               <w:rPr>
                 <w:sz w:val="15"/>
               </w:rPr>
-              <w:t>PI3Kalpha Inhibitor</w:t>
+              <w:t>Dual EGFR/HER2 TKI</w:t>
             </w:r>
           </w:p>
         </w:tc>
@@ -4627,7 +4627,7 @@
               <w:rPr>
                 <w:sz w:val="15"/>
               </w:rPr>
-              <w:t>DB12001</w:t>
+              <w:t>DB01259</w:t>
             </w:r>
           </w:p>
         </w:tc>
@@ -4646,7 +4646,7 @@
               <w:rPr>
                 <w:sz w:val="15"/>
               </w:rPr>
-              <w:t>1372.0</w:t>
+              <w:t>591.5</w:t>
             </w:r>
           </w:p>
         </w:tc>
@@ -4665,7 +4665,7 @@
               <w:rPr>
                 <w:sz w:val="15"/>
               </w:rPr>
-              <w:t>-12.08</w:t>
+              <w:t>-9.50</w:t>
             </w:r>
           </w:p>
         </w:tc>
@@ -4684,7 +4684,7 @@
               <w:rPr>
                 <w:sz w:val="15"/>
               </w:rPr>
-              <w:t>-34.86</w:t>
+              <w:t>-39.80</w:t>
             </w:r>
           </w:p>
         </w:tc>
@@ -4703,7 +4703,7 @@
               <w:rPr>
                 <w:sz w:val="15"/>
               </w:rPr>
-              <w:t>-38.01</w:t>
+              <w:t>-42.95</w:t>
             </w:r>
           </w:p>
         </w:tc>
@@ -4724,7 +4724,7 @@
               <w:rPr>
                 <w:sz w:val="15"/>
               </w:rPr>
-              <w:t>Palbociclib</w:t>
+              <w:t>Gefitinib</w:t>
             </w:r>
           </w:p>
         </w:tc>
@@ -4743,7 +4743,7 @@
               <w:rPr>
                 <w:sz w:val="15"/>
               </w:rPr>
-              <w:t>CDK4/6 Inhibitor</w:t>
+              <w:t>EGFR TKI</w:t>
             </w:r>
           </w:p>
         </w:tc>
@@ -4762,7 +4762,7 @@
               <w:rPr>
                 <w:sz w:val="15"/>
               </w:rPr>
-              <w:t>DB09073</w:t>
+              <w:t>DB00317</w:t>
             </w:r>
           </w:p>
         </w:tc>
@@ -4781,7 +4781,7 @@
               <w:rPr>
                 <w:sz w:val="15"/>
               </w:rPr>
-              <w:t>1339.9</w:t>
+              <w:t>446.9</w:t>
             </w:r>
           </w:p>
         </w:tc>
@@ -4800,7 +4800,7 @@
               <w:rPr>
                 <w:sz w:val="15"/>
               </w:rPr>
-              <w:t>-12.16</w:t>
+              <w:t>-9.10</w:t>
             </w:r>
           </w:p>
         </w:tc>
@@ -4819,7 +4819,7 @@
               <w:rPr>
                 <w:sz w:val="15"/>
               </w:rPr>
-              <w:t>-33.18</w:t>
+              <w:t>-32.10</w:t>
             </w:r>
           </w:p>
         </w:tc>
@@ -4838,7 +4838,7 @@
               <w:rPr>
                 <w:sz w:val="15"/>
               </w:rPr>
-              <w:t>-36.33</w:t>
+              <w:t>-35.25</w:t>
             </w:r>
           </w:p>
         </w:tc>
@@ -4859,7 +4859,7 @@
               <w:rPr>
                 <w:sz w:val="15"/>
               </w:rPr>
-              <w:t>Ribociclib</w:t>
+              <w:t>Osimertinib</w:t>
             </w:r>
           </w:p>
         </w:tc>
@@ -4878,7 +4878,7 @@
               <w:rPr>
                 <w:sz w:val="15"/>
               </w:rPr>
-              <w:t>CDK4/6 Inhibitor</w:t>
+              <w:t>EGFR TKI</w:t>
             </w:r>
           </w:p>
         </w:tc>
@@ -4897,7 +4897,7 @@
               <w:rPr>
                 <w:sz w:val="15"/>
               </w:rPr>
-              <w:t>DB09075</w:t>
+              <w:t>DB09330</w:t>
             </w:r>
           </w:p>
         </w:tc>
@@ -4916,7 +4916,7 @@
               <w:rPr>
                 <w:sz w:val="15"/>
               </w:rPr>
-              <w:t>1302.9</w:t>
+              <w:t>499.6</w:t>
             </w:r>
           </w:p>
         </w:tc>
@@ -4935,7 +4935,7 @@
               <w:rPr>
                 <w:sz w:val="15"/>
               </w:rPr>
-              <w:t>-11.54</w:t>
+              <w:t>-9.80</w:t>
             </w:r>
           </w:p>
         </w:tc>
@@ -4954,7 +4954,7 @@
               <w:rPr>
                 <w:sz w:val="15"/>
               </w:rPr>
-              <w:t>-29.73</w:t>
+              <w:t>-34.50</w:t>
             </w:r>
           </w:p>
         </w:tc>
@@ -4973,7 +4973,7 @@
               <w:rPr>
                 <w:sz w:val="15"/>
               </w:rPr>
-              <w:t>-32.88</w:t>
+              <w:t>-37.65</w:t>
             </w:r>
           </w:p>
         </w:tc>

</xml_diff>